<commit_message>
Match Emma skills to the JD's own terms for ATS
Co-Authored-By: Claude Opus 5.5 <noreply@anthropic.com>
Claude-Session: https://claude.ai/code/session_01Qg3JRGKeFtCXXeV9rGpzwA
</commit_message>
<xml_diff>
--- a/dist/Jessie-Chan-CV-emma-growth.docx
+++ b/dist/Jessie-Chan-CV-emma-growth.docx
@@ -620,6 +620,64 @@
           <w:sz w:val="20"/>
           <w:szCs w:val="20"/>
         </w:rPr>
+        <w:t xml:space="preserve">Organic acquisition: </w:t>
+      </w:r>
+      <w:r>
+        <w:rPr>
+          <w:rFonts w:ascii="Calibri" w:cs="Calibri" w:eastAsia="Calibri" w:hAnsi="Calibri"/>
+          <w:b w:val="false"/>
+          <w:bCs w:val="false"/>
+          <w:i w:val="false"/>
+          <w:iCs w:val="false"/>
+          <w:sz w:val="20"/>
+          <w:szCs w:val="20"/>
+        </w:rPr>
+        <w:t xml:space="preserve">ASO (App Store, Google Play, Custom Product Pages), referral programmes, affiliate and influencer partnerships, content marketing</w:t>
+      </w:r>
+    </w:p>
+    <w:p>
+      <w:pPr>
+        <w:spacing w:after="60"/>
+      </w:pPr>
+      <w:r>
+        <w:rPr>
+          <w:rFonts w:ascii="Calibri" w:cs="Calibri" w:eastAsia="Calibri" w:hAnsi="Calibri"/>
+          <w:b/>
+          <w:bCs/>
+          <w:i w:val="false"/>
+          <w:iCs w:val="false"/>
+          <w:sz w:val="20"/>
+          <w:szCs w:val="20"/>
+        </w:rPr>
+        <w:t xml:space="preserve">CRM &amp; lifecycle: </w:t>
+      </w:r>
+      <w:r>
+        <w:rPr>
+          <w:rFonts w:ascii="Calibri" w:cs="Calibri" w:eastAsia="Calibri" w:hAnsi="Calibri"/>
+          <w:b w:val="false"/>
+          <w:bCs w:val="false"/>
+          <w:i w:val="false"/>
+          <w:iCs w:val="false"/>
+          <w:sz w:val="20"/>
+          <w:szCs w:val="20"/>
+        </w:rPr>
+        <w:t xml:space="preserve">CRM and lifecycle marketing, email marketing, engagement, retention and reactivation, customer research</w:t>
+      </w:r>
+    </w:p>
+    <w:p>
+      <w:pPr>
+        <w:spacing w:after="60"/>
+      </w:pPr>
+      <w:r>
+        <w:rPr>
+          <w:rFonts w:ascii="Calibri" w:cs="Calibri" w:eastAsia="Calibri" w:hAnsi="Calibri"/>
+          <w:b/>
+          <w:bCs/>
+          <w:i w:val="false"/>
+          <w:iCs w:val="false"/>
+          <w:sz w:val="20"/>
+          <w:szCs w:val="20"/>
+        </w:rPr>
         <w:t xml:space="preserve">Growth: </w:t>
       </w:r>
       <w:r>
@@ -632,7 +690,7 @@
           <w:sz w:val="20"/>
           <w:szCs w:val="20"/>
         </w:rPr>
-        <w:t xml:space="preserve">ASO (App Store, Google Play, Custom Product Pages), CRM and lifecycle marketing, retention and reactivation, referral, affiliate and influencer partnerships, product launches, conversion rate optimisation, growth experimentation</w:t>
+        <w:t xml:space="preserve">Growth experimentation, A/B testing, conversion rate optimisation, landing pages and website content, product launches, acquisition analytics</w:t>
       </w:r>
     </w:p>
     <w:p>

</xml_diff>